<commit_message>
Update manual with TTS, section cut, history, and MCP server sections
Adds four new sections (11-14) documenting the new extensions:
- Section 11: Text-to-Speech (enable, rate, how it works)
- Section 12: Section Cut (define plane, preview, SVG export)
- Section 13: History and Snapshots (auto-history, named snapshots)
- Section 14: MCP Server (setup, available tools, design notes)

Renumbers existing sections 11-15 to 15-19. Adds command reference
subsections 17.13-17.16 with tables. Updates section 3.4 heading,
describe body text, undo section cross-reference, and feature ideas.

Co-Authored-By: Claude Opus 4.6 <noreply@anthropic.com>
</commit_message>
<xml_diff>
--- a/MANUAL.docx
+++ b/MANUAL.docx
@@ -1945,7 +1945,7 @@
           <w:sz w:val="26"/>
           <w:szCs w:val="26"/>
         </w:rPr>
-        <w:t xml:space="preserve">3.4  ROOMS, BLOCKS, LEGEND, TACTILE 3D, BAMBU, HATCH LIBRARY, PRINT</w:t>
+        <w:t>3.4  ROOMS, BLOCKS, LEGEND, TACTILE 3D, BAMBU, TTS, SECTION CUT, HATCH LIBRARY, PRINT</w:t>
       </w:r>
     </w:p>
     <w:p>
@@ -1963,7 +1963,7 @@
           <w:sz w:val="22"/>
           <w:szCs w:val="22"/>
         </w:rPr>
-        <w:t xml:space="preserve">These sections report all remaining model state: room assignments and hatches, aperture symbol configuration, legend layout, 3D print settings, Bambu printer configuration and scale, hatch image inventory, and output format.</w:t>
+        <w:t>These sections report all remaining model state: room assignments and hatches, aperture symbol configuration, legend layout, 3D print settings, Bambu printer configuration and scale, TTS status and rate, section cut definition, hatch image inventory, and output format.</w:t>
       </w:r>
     </w:p>
     <w:p>
@@ -6779,6 +6779,477 @@
     <w:p>
       <w:pPr>
         <w:pStyle w:val="Heading1"/>
+      </w:pPr>
+      <w:r>
+        <w:t xml:space="preserve">11  Text-to-Speech</w:t>
+      </w:r>
+    </w:p>
+    <w:p>
+      <w:r>
+        <w:t xml:space="preserve">The controller can speak command responses aloud using Windows text-to-speech. This provides immediate audio confirmation of every action without requiring a screen reader to be active.</w:t>
+      </w:r>
+    </w:p>
+    <w:p>
+      <w:pPr>
+        <w:pStyle w:val="Heading2"/>
+      </w:pPr>
+      <w:r>
+        <w:t xml:space="preserve">11.1  Enable TTS</w:t>
+      </w:r>
+    </w:p>
+    <w:p>
+      <w:r>
+        <w:t xml:space="preserve">CLI</w:t>
+      </w:r>
+    </w:p>
+    <w:p>
+      <w:r>
+        <w:t xml:space="preserve">  tts on                             # start speaking responses</w:t>
+      </w:r>
+    </w:p>
+    <w:p>
+      <w:r>
+        <w:t xml:space="preserve">  tts off                            # silence</w:t>
+      </w:r>
+    </w:p>
+    <w:p>
+      <w:r>
+        <w:t xml:space="preserve">  tts                                # show current status</w:t>
+      </w:r>
+    </w:p>
+    <w:p>
+      <w:r>
+        <w:t xml:space="preserve">You can also enable TTS at startup with the --tts flag:</w:t>
+      </w:r>
+    </w:p>
+    <w:p>
+      <w:r>
+        <w:t xml:space="preserve">  python controller_cli.py --tts</w:t>
+      </w:r>
+    </w:p>
+    <w:p>
+      <w:pPr>
+        <w:pStyle w:val="Heading2"/>
+      </w:pPr>
+      <w:r>
+        <w:t xml:space="preserve">11.2  Speech Rate</w:t>
+      </w:r>
+    </w:p>
+    <w:p>
+      <w:r>
+        <w:t xml:space="preserve">Rate ranges from -10 (slowest) to 10 (fastest). The default is 2.</w:t>
+      </w:r>
+    </w:p>
+    <w:p>
+      <w:r>
+        <w:t xml:space="preserve">CLI</w:t>
+      </w:r>
+    </w:p>
+    <w:p>
+      <w:r>
+        <w:t xml:space="preserve">  tts rate 5                         # faster</w:t>
+      </w:r>
+    </w:p>
+    <w:p>
+      <w:r>
+        <w:t xml:space="preserve">  tts rate -2                        # slower</w:t>
+      </w:r>
+    </w:p>
+    <w:p>
+      <w:r>
+        <w:t xml:space="preserve">  tts rate 0                         # normal Windows default</w:t>
+      </w:r>
+    </w:p>
+    <w:p>
+      <w:pPr>
+        <w:pStyle w:val="Heading2"/>
+      </w:pPr>
+      <w:r>
+        <w:t xml:space="preserve">11.3  How It Works</w:t>
+      </w:r>
+    </w:p>
+    <w:p>
+      <w:r>
+        <w:t xml:space="preserve">TTS uses PowerShell's System.Speech.Synthesis.SpeechSynthesizer, which is built into Windows. No additional software is needed. Each response is spoken in a fire-and-forget subprocess so it does not block typing the next command.</w:t>
+      </w:r>
+    </w:p>
+    <w:p>
+      <w:r>
+        <w:t xml:space="preserve">The OK: and ERROR: prefixes are stripped before speaking for cleaner audio. If speech fails on the first attempt (for example, on a system without the speech assembly), TTS is silently disabled for the rest of the session.</w:t>
+      </w:r>
+    </w:p>
+    <w:p>
+      <w:r>
+        <w:t xml:space="preserve">TTS settings are saved in the state file and persist across sessions.</w:t>
+      </w:r>
+    </w:p>
+    <w:p>
+      <w:r>
+        <w:t xml:space="preserve"/>
+      </w:r>
+    </w:p>
+    <w:p>
+      <w:pPr>
+        <w:pStyle w:val="Heading1"/>
+      </w:pPr>
+      <w:r>
+        <w:t xml:space="preserve">12  Section Cut</w:t>
+      </w:r>
+    </w:p>
+    <w:p>
+      <w:r>
+        <w:t xml:space="preserve">A section cut slices the 3D wall mesh with a vertical plane and exports the resulting profile as SVG. This is useful for understanding wall relationships in section and for producing tactile section drawings.</w:t>
+      </w:r>
+    </w:p>
+    <w:p>
+      <w:pPr>
+        <w:pStyle w:val="Heading2"/>
+      </w:pPr>
+      <w:r>
+        <w:t xml:space="preserve">12.1  Define a Cut Plane</w:t>
+      </w:r>
+    </w:p>
+    <w:p>
+      <w:r>
+        <w:t xml:space="preserve">Specify the axis the plane is perpendicular to and the position along that axis in feet. Walls must be enabled on at least one rectangular bay.</w:t>
+      </w:r>
+    </w:p>
+    <w:p>
+      <w:r>
+        <w:t xml:space="preserve">CLI</w:t>
+      </w:r>
+    </w:p>
+    <w:p>
+      <w:r>
+        <w:t xml:space="preserve">  section x 42                       # cut perpendicular to X at 42 ft</w:t>
+      </w:r>
+    </w:p>
+    <w:p>
+      <w:r>
+        <w:t xml:space="preserve">  section y 100                      # cut perpendicular to Y at 100 ft</w:t>
+      </w:r>
+    </w:p>
+    <w:p>
+      <w:pPr>
+        <w:pStyle w:val="Heading2"/>
+      </w:pPr>
+      <w:r>
+        <w:t xml:space="preserve">12.2  Preview</w:t>
+      </w:r>
+    </w:p>
+    <w:p>
+      <w:r>
+        <w:t xml:space="preserve">Preview shows how many wall segments the plane intersects and the extent of the resulting section profile, without writing a file.</w:t>
+      </w:r>
+    </w:p>
+    <w:p>
+      <w:r>
+        <w:t xml:space="preserve">CLI</w:t>
+      </w:r>
+    </w:p>
+    <w:p>
+      <w:r>
+        <w:t xml:space="preserve">  section preview</w:t>
+      </w:r>
+    </w:p>
+    <w:p>
+      <w:r>
+        <w:t xml:space="preserve">  # Section X=42.0: 48 segments, extent 260.0 x 4.5 ft.</w:t>
+      </w:r>
+    </w:p>
+    <w:p>
+      <w:pPr>
+        <w:pStyle w:val="Heading2"/>
+      </w:pPr>
+      <w:r>
+        <w:t xml:space="preserve">12.3  Export SVG</w:t>
+      </w:r>
+    </w:p>
+    <w:p>
+      <w:r>
+        <w:t xml:space="preserve">Export writes an SVG file with black lines on white background. The default filename is section_&lt;axis&gt;_&lt;offset&gt;.svg in the current folder.</w:t>
+      </w:r>
+    </w:p>
+    <w:p>
+      <w:r>
+        <w:t xml:space="preserve">CLI</w:t>
+      </w:r>
+    </w:p>
+    <w:p>
+      <w:r>
+        <w:t xml:space="preserve">  section export                     # default path</w:t>
+      </w:r>
+    </w:p>
+    <w:p>
+      <w:r>
+        <w:t xml:space="preserve">  section export "./cuts/north.svg"  # custom path</w:t>
+      </w:r>
+    </w:p>
+    <w:p>
+      <w:pPr>
+        <w:pStyle w:val="Heading2"/>
+      </w:pPr>
+      <w:r>
+        <w:t xml:space="preserve">12.4  List and Clear</w:t>
+      </w:r>
+    </w:p>
+    <w:p>
+      <w:r>
+        <w:t xml:space="preserve">CLI</w:t>
+      </w:r>
+    </w:p>
+    <w:p>
+      <w:r>
+        <w:t xml:space="preserve">  section list                       # show current settings</w:t>
+      </w:r>
+    </w:p>
+    <w:p>
+      <w:r>
+        <w:t xml:space="preserve">  section clear                      # remove section definition</w:t>
+      </w:r>
+    </w:p>
+    <w:p>
+      <w:r>
+        <w:t xml:space="preserve">The section cut definition is saved in the state file and persists across sessions. Radial bays are not included in the mesh — only rectangular bays with walls enabled.</w:t>
+      </w:r>
+    </w:p>
+    <w:p>
+      <w:r>
+        <w:t xml:space="preserve"/>
+      </w:r>
+    </w:p>
+    <w:p>
+      <w:pPr>
+        <w:pStyle w:val="Heading1"/>
+      </w:pPr>
+      <w:r>
+        <w:t xml:space="preserve">13  History and Snapshots</w:t>
+      </w:r>
+    </w:p>
+    <w:p>
+      <w:r>
+        <w:t xml:space="preserve">Every mutating command automatically saves a numbered copy of the state to a history folder alongside the state file. Named snapshots let you bookmark important design states and return to them later.</w:t>
+      </w:r>
+    </w:p>
+    <w:p>
+      <w:pPr>
+        <w:pStyle w:val="Heading2"/>
+      </w:pPr>
+      <w:r>
+        <w:t xml:space="preserve">13.1  Automatic History</w:t>
+      </w:r>
+    </w:p>
+    <w:p>
+      <w:r>
+        <w:t xml:space="preserve">Each time you run a command that changes the model, the controller writes a copy to history/0001.json, history/0002.json, and so on. Undo deletes the most recent history entry. The history folder is created automatically next to the state file.</w:t>
+      </w:r>
+    </w:p>
+    <w:p>
+      <w:r>
+        <w:t xml:space="preserve">CLI</w:t>
+      </w:r>
+    </w:p>
+    <w:p>
+      <w:r>
+        <w:t xml:space="preserve">  history count                      # number of history entries</w:t>
+      </w:r>
+    </w:p>
+    <w:p>
+      <w:r>
+        <w:t xml:space="preserve">  history list                       # last 20 entries + named snapshots</w:t>
+      </w:r>
+    </w:p>
+    <w:p>
+      <w:pPr>
+        <w:pStyle w:val="Heading2"/>
+      </w:pPr>
+      <w:r>
+        <w:t xml:space="preserve">13.2  Named Snapshots</w:t>
+      </w:r>
+    </w:p>
+    <w:p>
+      <w:r>
+        <w:t xml:space="preserve">Snapshots are named bookmarks saved in the same history folder. Unlike numbered entries, they are not affected by undo.</w:t>
+      </w:r>
+    </w:p>
+    <w:p>
+      <w:r>
+        <w:t xml:space="preserve">CLI</w:t>
+      </w:r>
+    </w:p>
+    <w:p>
+      <w:r>
+        <w:t xml:space="preserve">  snapshot save before_walls          # save current state</w:t>
+      </w:r>
+    </w:p>
+    <w:p>
+      <w:r>
+        <w:t xml:space="preserve">  snapshot save "end of day"          # names with spaces</w:t>
+      </w:r>
+    </w:p>
+    <w:p>
+      <w:r>
+        <w:t xml:space="preserve">  snapshot list                       # show all named snapshots</w:t>
+      </w:r>
+    </w:p>
+    <w:p>
+      <w:r>
+        <w:t xml:space="preserve">  snapshot load before_walls          # restore a snapshot</w:t>
+      </w:r>
+    </w:p>
+    <w:p>
+      <w:r>
+        <w:t xml:space="preserve">Loading a snapshot replaces the entire current state. The previous state is pushed onto the undo stack, so you can undo the load if needed.</w:t>
+      </w:r>
+    </w:p>
+    <w:p>
+      <w:pPr>
+        <w:pStyle w:val="Heading2"/>
+      </w:pPr>
+      <w:r>
+        <w:t xml:space="preserve">13.3  History Folder</w:t>
+      </w:r>
+    </w:p>
+    <w:p>
+      <w:r>
+        <w:t xml:space="preserve">The history folder is a sibling of the state file and is not part of the JSON state. It is excluded from version control by the .gitignore file.</w:t>
+      </w:r>
+    </w:p>
+    <w:p>
+      <w:r>
+        <w:t xml:space="preserve">  history/</w:t>
+      </w:r>
+    </w:p>
+    <w:p>
+      <w:r>
+        <w:t xml:space="preserve">    0001.json                        # numbered entries</w:t>
+      </w:r>
+    </w:p>
+    <w:p>
+      <w:r>
+        <w:t xml:space="preserve">    0002.json</w:t>
+      </w:r>
+    </w:p>
+    <w:p>
+      <w:r>
+        <w:t xml:space="preserve">    snapshot_before_walls.json        # named snapshots</w:t>
+      </w:r>
+    </w:p>
+    <w:p>
+      <w:r>
+        <w:t xml:space="preserve"/>
+      </w:r>
+    </w:p>
+    <w:p>
+      <w:pPr>
+        <w:pStyle w:val="Heading1"/>
+      </w:pPr>
+      <w:r>
+        <w:t xml:space="preserve">14  MCP Server</w:t>
+      </w:r>
+    </w:p>
+    <w:p>
+      <w:r>
+        <w:t xml:space="preserve">The MCP (Model Context Protocol) server wraps the CLI so that AI assistants like Claude Desktop or Cursor can drive the jig conversationally over stdio. This is the one component that requires an external package.</w:t>
+      </w:r>
+    </w:p>
+    <w:p>
+      <w:pPr>
+        <w:pStyle w:val="Heading2"/>
+      </w:pPr>
+      <w:r>
+        <w:t xml:space="preserve">14.1  Setup</w:t>
+      </w:r>
+    </w:p>
+    <w:p>
+      <w:r>
+        <w:t xml:space="preserve">Install the MCP package:</w:t>
+      </w:r>
+    </w:p>
+    <w:p>
+      <w:r>
+        <w:t xml:space="preserve">  pip install mcp</w:t>
+      </w:r>
+    </w:p>
+    <w:p>
+      <w:r>
+        <w:t xml:space="preserve">Configure Claude Desktop by adding an entry to claude_desktop_config.json:</w:t>
+      </w:r>
+    </w:p>
+    <w:p>
+      <w:r>
+        <w:t xml:space="preserve">  { "mcpServers": { "layout-jig": { "command": "python", "args": ["path/to/mcp_server.py", "--state", "path/to/state.json"] } } }</w:t>
+      </w:r>
+    </w:p>
+    <w:p>
+      <w:r>
+        <w:t xml:space="preserve">Or set the environment variable LAYOUT_JIG_STATE and omit --state.</w:t>
+      </w:r>
+    </w:p>
+    <w:p>
+      <w:pPr>
+        <w:pStyle w:val="Heading2"/>
+      </w:pPr>
+      <w:r>
+        <w:t xml:space="preserve">14.2  Available Tools</w:t>
+      </w:r>
+    </w:p>
+    <w:p>
+      <w:r>
+        <w:t xml:space="preserve">The server exposes five MCP tools:</w:t>
+      </w:r>
+    </w:p>
+    <w:p>
+      <w:r>
+        <w:t xml:space="preserve">run_command(command) — Execute any CLI command. Returns the same OK:/ERROR: messages the terminal prints.</w:t>
+      </w:r>
+    </w:p>
+    <w:p>
+      <w:r>
+        <w:t xml:space="preserve">describe() — Full text model description.</w:t>
+      </w:r>
+    </w:p>
+    <w:p>
+      <w:r>
+        <w:t xml:space="preserve">list_bays() — Compact bay table.</w:t>
+      </w:r>
+    </w:p>
+    <w:p>
+      <w:r>
+        <w:t xml:space="preserve">get_state() — Raw JSON contents of the state file.</w:t>
+      </w:r>
+    </w:p>
+    <w:p>
+      <w:r>
+        <w:t xml:space="preserve">get_help() — Full command reference text.</w:t>
+      </w:r>
+    </w:p>
+    <w:p>
+      <w:pPr>
+        <w:pStyle w:val="Heading2"/>
+      </w:pPr>
+      <w:r>
+        <w:t xml:space="preserve">14.3  Design Notes</w:t>
+      </w:r>
+    </w:p>
+    <w:p>
+      <w:r>
+        <w:t xml:space="preserve">Each tool call loads state from disk, runs the command, and saves back. There is no persistent session, so undo is not available in MCP mode. The server returns an error suggesting named snapshots (Section 13.2) instead.</w:t>
+      </w:r>
+    </w:p>
+    <w:p>
+      <w:r>
+        <w:t xml:space="preserve">Stdout is reserved for JSON-RPC transport. All print output from the controller is redirected to stderr.</w:t>
+      </w:r>
+    </w:p>
+    <w:p>
+      <w:r>
+        <w:t xml:space="preserve"/>
+      </w:r>
+    </w:p>
+    <w:p>
+      <w:pPr>
+        <w:pStyle w:val="Heading1"/>
         <w:pBdr>
           <w:bottom w:val="single" w:color="2C3E7B" w:sz="4" w:space="10"/>
         </w:pBdr>
@@ -6795,7 +7266,7 @@
           <w:sz w:val="36"/>
           <w:szCs w:val="36"/>
         </w:rPr>
-        <w:t xml:space="preserve">11  Style Variables</w:t>
+        <w:t>15  Style Variables</w:t>
       </w:r>
     </w:p>
     <w:p>
@@ -8379,7 +8850,7 @@
           <w:sz w:val="36"/>
           <w:szCs w:val="36"/>
         </w:rPr>
-        <w:t xml:space="preserve">12  Output and Utilities</w:t>
+        <w:t>16  Output and Utilities</w:t>
       </w:r>
     </w:p>
     <w:p>
@@ -8398,7 +8869,7 @@
           <w:sz w:val="26"/>
           <w:szCs w:val="26"/>
         </w:rPr>
-        <w:t xml:space="preserve">12.1  Print Output</w:t>
+        <w:t>16.1  Print Output</w:t>
       </w:r>
     </w:p>
     <w:p>
@@ -8573,7 +9044,7 @@
           <w:sz w:val="26"/>
           <w:szCs w:val="26"/>
         </w:rPr>
-        <w:t xml:space="preserve">12.2  Hatch Library</w:t>
+        <w:t>16.2  Hatch Library</w:t>
       </w:r>
     </w:p>
     <w:p>
@@ -8697,7 +9168,7 @@
           <w:sz w:val="26"/>
           <w:szCs w:val="26"/>
         </w:rPr>
-        <w:t xml:space="preserve">12.3  Undo, Help, Quit</w:t>
+        <w:t>16.3  Undo, History, Help, Quit</w:t>
       </w:r>
     </w:p>
     <w:p>
@@ -8742,6 +9213,11 @@
       </w:r>
     </w:p>
     <w:p>
+      <w:r>
+        <w:t xml:space="preserve">Each undo also removes the last history entry. See Section 13 for named snapshots.</w:t>
+      </w:r>
+    </w:p>
+    <w:p>
       <w:pPr>
         <w:pBdr>
           <w:left w:val="single" w:color="BDC3C7" w:sz="8" w:space="8"/>
@@ -8834,7 +9310,7 @@
           <w:sz w:val="36"/>
           <w:szCs w:val="36"/>
         </w:rPr>
-        <w:t xml:space="preserve">13  Command Reference</w:t>
+        <w:t>17  Command Reference</w:t>
       </w:r>
     </w:p>
     <w:p>
@@ -8936,7 +9412,7 @@
           <w:sz w:val="26"/>
           <w:szCs w:val="26"/>
         </w:rPr>
-        <w:t xml:space="preserve">13.1  General</w:t>
+        <w:t>17.1  General</w:t>
       </w:r>
     </w:p>
     <w:tbl>
@@ -9544,7 +10020,7 @@
           <w:sz w:val="26"/>
           <w:szCs w:val="26"/>
         </w:rPr>
-        <w:t xml:space="preserve">13.2  Site and Style</w:t>
+        <w:t>17.2  Site and Style</w:t>
       </w:r>
     </w:p>
     <w:tbl>
@@ -9864,7 +10340,7 @@
           <w:sz w:val="26"/>
           <w:szCs w:val="26"/>
         </w:rPr>
-        <w:t xml:space="preserve">13.3  Bay Configuration</w:t>
+        <w:t>17.3  Bay Configuration</w:t>
       </w:r>
     </w:p>
     <w:tbl>
@@ -10904,7 +11380,7 @@
           <w:sz w:val="26"/>
           <w:szCs w:val="26"/>
         </w:rPr>
-        <w:t xml:space="preserve">13.4  Walls and Apertures</w:t>
+        <w:t>17.4  Walls and Apertures</w:t>
       </w:r>
     </w:p>
     <w:tbl>
@@ -11440,7 +11916,7 @@
           <w:sz w:val="26"/>
           <w:szCs w:val="26"/>
         </w:rPr>
-        <w:t xml:space="preserve">13.5  Corridors</w:t>
+        <w:t>17.5  Corridors</w:t>
       </w:r>
     </w:p>
     <w:tbl>
@@ -12048,7 +12524,7 @@
           <w:sz w:val="26"/>
           <w:szCs w:val="26"/>
         </w:rPr>
-        <w:t xml:space="preserve">13.6  Rooms</w:t>
+        <w:t>17.6  Rooms</w:t>
       </w:r>
     </w:p>
     <w:tbl>
@@ -12656,7 +13132,7 @@
           <w:sz w:val="26"/>
           <w:szCs w:val="26"/>
         </w:rPr>
-        <w:t xml:space="preserve">13.7  Cell Rooms</w:t>
+        <w:t>17.7  Cell Rooms</w:t>
       </w:r>
     </w:p>
     <w:tbl>
@@ -13624,7 +14100,7 @@
           <w:sz w:val="26"/>
           <w:szCs w:val="26"/>
         </w:rPr>
-        <w:t xml:space="preserve">13.8  Legend</w:t>
+        <w:t>17.8  Legend</w:t>
       </w:r>
     </w:p>
     <w:tbl>
@@ -14160,7 +14636,7 @@
           <w:sz w:val="26"/>
           <w:szCs w:val="26"/>
         </w:rPr>
-        <w:t xml:space="preserve">13.9  Block Symbols</w:t>
+        <w:t>17.9  Block Symbols</w:t>
       </w:r>
     </w:p>
     <w:tbl>
@@ -14552,7 +15028,7 @@
           <w:sz w:val="26"/>
           <w:szCs w:val="26"/>
         </w:rPr>
-        <w:t xml:space="preserve">13.10  Tactile 3D</w:t>
+        <w:t>17.10  Tactile 3D</w:t>
       </w:r>
     </w:p>
     <w:tbl>
@@ -15160,7 +15636,7 @@
           <w:sz w:val="26"/>
           <w:szCs w:val="26"/>
         </w:rPr>
-        <w:t xml:space="preserve">13.11  Bambu Printer</w:t>
+        <w:t>17.11  Bambu Printer</w:t>
       </w:r>
     </w:p>
     <w:tbl>
@@ -15984,7 +16460,7 @@
           <w:sz w:val="26"/>
           <w:szCs w:val="26"/>
         </w:rPr>
-        <w:t xml:space="preserve">13.12  Hatch Library and Print</w:t>
+        <w:t>17.12  Hatch Library and Print</w:t>
       </w:r>
     </w:p>
     <w:tbl>
@@ -16439,6 +16915,562 @@
     </w:p>
     <w:p>
       <w:pPr>
+        <w:pStyle w:val="Heading2"/>
+      </w:pPr>
+      <w:r>
+        <w:t xml:space="preserve">17.13  Text-to-Speech</w:t>
+      </w:r>
+    </w:p>
+    <w:tbl>
+      <w:tblPr>
+        <w:tblW w:type="auto" w:w="0"/>
+        <w:tblLook w:firstColumn="1" w:firstRow="1" w:lastColumn="0" w:lastRow="0" w:noHBand="0" w:noVBand="1" w:val="04A0"/>
+      </w:tblPr>
+      <w:tblGrid>
+        <w:gridCol w:w="4680"/>
+        <w:gridCol w:w="4680"/>
+      </w:tblGrid>
+      <w:tr>
+        <w:tc>
+          <w:tcPr>
+            <w:tcW w:type="dxa" w:w="4680"/>
+          </w:tcPr>
+          <w:p>
+            <w:r>
+              <w:t>Command</w:t>
+            </w:r>
+          </w:p>
+        </w:tc>
+        <w:tc>
+          <w:tcPr>
+            <w:tcW w:type="dxa" w:w="4680"/>
+          </w:tcPr>
+          <w:p>
+            <w:r>
+              <w:t>Description</w:t>
+            </w:r>
+          </w:p>
+        </w:tc>
+      </w:tr>
+      <w:tr>
+        <w:tc>
+          <w:tcPr>
+            <w:tcW w:type="dxa" w:w="4680"/>
+          </w:tcPr>
+          <w:p>
+            <w:r>
+              <w:t>tts</w:t>
+            </w:r>
+          </w:p>
+        </w:tc>
+        <w:tc>
+          <w:tcPr>
+            <w:tcW w:type="dxa" w:w="4680"/>
+          </w:tcPr>
+          <w:p>
+            <w:r>
+              <w:t>Show TTS status</w:t>
+            </w:r>
+          </w:p>
+        </w:tc>
+      </w:tr>
+      <w:tr>
+        <w:tc>
+          <w:tcPr>
+            <w:tcW w:type="dxa" w:w="4680"/>
+          </w:tcPr>
+          <w:p>
+            <w:r>
+              <w:t>tts on|off</w:t>
+            </w:r>
+          </w:p>
+        </w:tc>
+        <w:tc>
+          <w:tcPr>
+            <w:tcW w:type="dxa" w:w="4680"/>
+          </w:tcPr>
+          <w:p>
+            <w:r>
+              <w:t>Enable or disable speech</w:t>
+            </w:r>
+          </w:p>
+        </w:tc>
+      </w:tr>
+      <w:tr>
+        <w:tc>
+          <w:tcPr>
+            <w:tcW w:type="dxa" w:w="4680"/>
+          </w:tcPr>
+          <w:p>
+            <w:r>
+              <w:t>tts rate &lt;-10..10&gt;</w:t>
+            </w:r>
+          </w:p>
+        </w:tc>
+        <w:tc>
+          <w:tcPr>
+            <w:tcW w:type="dxa" w:w="4680"/>
+          </w:tcPr>
+          <w:p>
+            <w:r>
+              <w:t>Set speech rate</w:t>
+            </w:r>
+          </w:p>
+        </w:tc>
+      </w:tr>
+    </w:tbl>
+    <w:p>
+      <w:pPr>
+        <w:pStyle w:val="Heading2"/>
+      </w:pPr>
+      <w:r>
+        <w:t xml:space="preserve">17.14  Section Cut</w:t>
+      </w:r>
+    </w:p>
+    <w:tbl>
+      <w:tblPr>
+        <w:tblW w:type="auto" w:w="0"/>
+        <w:tblLook w:firstColumn="1" w:firstRow="1" w:lastColumn="0" w:lastRow="0" w:noHBand="0" w:noVBand="1" w:val="04A0"/>
+      </w:tblPr>
+      <w:tblGrid>
+        <w:gridCol w:w="4680"/>
+        <w:gridCol w:w="4680"/>
+      </w:tblGrid>
+      <w:tr>
+        <w:tc>
+          <w:tcPr>
+            <w:tcW w:type="dxa" w:w="4680"/>
+          </w:tcPr>
+          <w:p>
+            <w:r>
+              <w:t>Command</w:t>
+            </w:r>
+          </w:p>
+        </w:tc>
+        <w:tc>
+          <w:tcPr>
+            <w:tcW w:type="dxa" w:w="4680"/>
+          </w:tcPr>
+          <w:p>
+            <w:r>
+              <w:t>Description</w:t>
+            </w:r>
+          </w:p>
+        </w:tc>
+      </w:tr>
+      <w:tr>
+        <w:tc>
+          <w:tcPr>
+            <w:tcW w:type="dxa" w:w="4680"/>
+          </w:tcPr>
+          <w:p>
+            <w:r>
+              <w:t>section x|y &lt;offset&gt;</w:t>
+            </w:r>
+          </w:p>
+        </w:tc>
+        <w:tc>
+          <w:tcPr>
+            <w:tcW w:type="dxa" w:w="4680"/>
+          </w:tcPr>
+          <w:p>
+            <w:r>
+              <w:t>Define cut plane</w:t>
+            </w:r>
+          </w:p>
+        </w:tc>
+      </w:tr>
+      <w:tr>
+        <w:tc>
+          <w:tcPr>
+            <w:tcW w:type="dxa" w:w="4680"/>
+          </w:tcPr>
+          <w:p>
+            <w:r>
+              <w:t>section preview</w:t>
+            </w:r>
+          </w:p>
+        </w:tc>
+        <w:tc>
+          <w:tcPr>
+            <w:tcW w:type="dxa" w:w="4680"/>
+          </w:tcPr>
+          <w:p>
+            <w:r>
+              <w:t>Segment count and extent</w:t>
+            </w:r>
+          </w:p>
+        </w:tc>
+      </w:tr>
+      <w:tr>
+        <w:tc>
+          <w:tcPr>
+            <w:tcW w:type="dxa" w:w="4680"/>
+          </w:tcPr>
+          <w:p>
+            <w:r>
+              <w:t>section export [path]</w:t>
+            </w:r>
+          </w:p>
+        </w:tc>
+        <w:tc>
+          <w:tcPr>
+            <w:tcW w:type="dxa" w:w="4680"/>
+          </w:tcPr>
+          <w:p>
+            <w:r>
+              <w:t>Export SVG</w:t>
+            </w:r>
+          </w:p>
+        </w:tc>
+      </w:tr>
+      <w:tr>
+        <w:tc>
+          <w:tcPr>
+            <w:tcW w:type="dxa" w:w="4680"/>
+          </w:tcPr>
+          <w:p>
+            <w:r>
+              <w:t>section list</w:t>
+            </w:r>
+          </w:p>
+        </w:tc>
+        <w:tc>
+          <w:tcPr>
+            <w:tcW w:type="dxa" w:w="4680"/>
+          </w:tcPr>
+          <w:p>
+            <w:r>
+              <w:t>Current section settings</w:t>
+            </w:r>
+          </w:p>
+        </w:tc>
+      </w:tr>
+      <w:tr>
+        <w:tc>
+          <w:tcPr>
+            <w:tcW w:type="dxa" w:w="4680"/>
+          </w:tcPr>
+          <w:p>
+            <w:r>
+              <w:t>section clear</w:t>
+            </w:r>
+          </w:p>
+        </w:tc>
+        <w:tc>
+          <w:tcPr>
+            <w:tcW w:type="dxa" w:w="4680"/>
+          </w:tcPr>
+          <w:p>
+            <w:r>
+              <w:t>Remove section definition</w:t>
+            </w:r>
+          </w:p>
+        </w:tc>
+      </w:tr>
+    </w:tbl>
+    <w:p>
+      <w:pPr>
+        <w:pStyle w:val="Heading2"/>
+      </w:pPr>
+      <w:r>
+        <w:t xml:space="preserve">17.15  History and Snapshots</w:t>
+      </w:r>
+    </w:p>
+    <w:tbl>
+      <w:tblPr>
+        <w:tblW w:type="auto" w:w="0"/>
+        <w:tblLook w:firstColumn="1" w:firstRow="1" w:lastColumn="0" w:lastRow="0" w:noHBand="0" w:noVBand="1" w:val="04A0"/>
+      </w:tblPr>
+      <w:tblGrid>
+        <w:gridCol w:w="4680"/>
+        <w:gridCol w:w="4680"/>
+      </w:tblGrid>
+      <w:tr>
+        <w:tc>
+          <w:tcPr>
+            <w:tcW w:type="dxa" w:w="4680"/>
+          </w:tcPr>
+          <w:p>
+            <w:r>
+              <w:t>Command</w:t>
+            </w:r>
+          </w:p>
+        </w:tc>
+        <w:tc>
+          <w:tcPr>
+            <w:tcW w:type="dxa" w:w="4680"/>
+          </w:tcPr>
+          <w:p>
+            <w:r>
+              <w:t>Description</w:t>
+            </w:r>
+          </w:p>
+        </w:tc>
+      </w:tr>
+      <w:tr>
+        <w:tc>
+          <w:tcPr>
+            <w:tcW w:type="dxa" w:w="4680"/>
+          </w:tcPr>
+          <w:p>
+            <w:r>
+              <w:t>history list</w:t>
+            </w:r>
+          </w:p>
+        </w:tc>
+        <w:tc>
+          <w:tcPr>
+            <w:tcW w:type="dxa" w:w="4680"/>
+          </w:tcPr>
+          <w:p>
+            <w:r>
+              <w:t>Last 20 entries + named snapshots</w:t>
+            </w:r>
+          </w:p>
+        </w:tc>
+      </w:tr>
+      <w:tr>
+        <w:tc>
+          <w:tcPr>
+            <w:tcW w:type="dxa" w:w="4680"/>
+          </w:tcPr>
+          <w:p>
+            <w:r>
+              <w:t>history count</w:t>
+            </w:r>
+          </w:p>
+        </w:tc>
+        <w:tc>
+          <w:tcPr>
+            <w:tcW w:type="dxa" w:w="4680"/>
+          </w:tcPr>
+          <w:p>
+            <w:r>
+              <w:t>Number of history entries</w:t>
+            </w:r>
+          </w:p>
+        </w:tc>
+      </w:tr>
+      <w:tr>
+        <w:tc>
+          <w:tcPr>
+            <w:tcW w:type="dxa" w:w="4680"/>
+          </w:tcPr>
+          <w:p>
+            <w:r>
+              <w:t>snapshot save &lt;name&gt;</w:t>
+            </w:r>
+          </w:p>
+        </w:tc>
+        <w:tc>
+          <w:tcPr>
+            <w:tcW w:type="dxa" w:w="4680"/>
+          </w:tcPr>
+          <w:p>
+            <w:r>
+              <w:t>Save named snapshot</w:t>
+            </w:r>
+          </w:p>
+        </w:tc>
+      </w:tr>
+      <w:tr>
+        <w:tc>
+          <w:tcPr>
+            <w:tcW w:type="dxa" w:w="4680"/>
+          </w:tcPr>
+          <w:p>
+            <w:r>
+              <w:t>snapshot load &lt;name&gt;</w:t>
+            </w:r>
+          </w:p>
+        </w:tc>
+        <w:tc>
+          <w:tcPr>
+            <w:tcW w:type="dxa" w:w="4680"/>
+          </w:tcPr>
+          <w:p>
+            <w:r>
+              <w:t>Restore named snapshot</w:t>
+            </w:r>
+          </w:p>
+        </w:tc>
+      </w:tr>
+      <w:tr>
+        <w:tc>
+          <w:tcPr>
+            <w:tcW w:type="dxa" w:w="4680"/>
+          </w:tcPr>
+          <w:p>
+            <w:r>
+              <w:t>snapshot list</w:t>
+            </w:r>
+          </w:p>
+        </w:tc>
+        <w:tc>
+          <w:tcPr>
+            <w:tcW w:type="dxa" w:w="4680"/>
+          </w:tcPr>
+          <w:p>
+            <w:r>
+              <w:t>List all named snapshots</w:t>
+            </w:r>
+          </w:p>
+        </w:tc>
+      </w:tr>
+    </w:tbl>
+    <w:p>
+      <w:pPr>
+        <w:pStyle w:val="Heading2"/>
+      </w:pPr>
+      <w:r>
+        <w:t xml:space="preserve">17.16  MCP Server (tools)</w:t>
+      </w:r>
+    </w:p>
+    <w:tbl>
+      <w:tblPr>
+        <w:tblW w:type="auto" w:w="0"/>
+        <w:tblLook w:firstColumn="1" w:firstRow="1" w:lastColumn="0" w:lastRow="0" w:noHBand="0" w:noVBand="1" w:val="04A0"/>
+      </w:tblPr>
+      <w:tblGrid>
+        <w:gridCol w:w="4680"/>
+        <w:gridCol w:w="4680"/>
+      </w:tblGrid>
+      <w:tr>
+        <w:tc>
+          <w:tcPr>
+            <w:tcW w:type="dxa" w:w="4680"/>
+          </w:tcPr>
+          <w:p>
+            <w:r>
+              <w:t>Tool</w:t>
+            </w:r>
+          </w:p>
+        </w:tc>
+        <w:tc>
+          <w:tcPr>
+            <w:tcW w:type="dxa" w:w="4680"/>
+          </w:tcPr>
+          <w:p>
+            <w:r>
+              <w:t>Description</w:t>
+            </w:r>
+          </w:p>
+        </w:tc>
+      </w:tr>
+      <w:tr>
+        <w:tc>
+          <w:tcPr>
+            <w:tcW w:type="dxa" w:w="4680"/>
+          </w:tcPr>
+          <w:p>
+            <w:r>
+              <w:t>run_command(command)</w:t>
+            </w:r>
+          </w:p>
+        </w:tc>
+        <w:tc>
+          <w:tcPr>
+            <w:tcW w:type="dxa" w:w="4680"/>
+          </w:tcPr>
+          <w:p>
+            <w:r>
+              <w:t>Execute any CLI command</w:t>
+            </w:r>
+          </w:p>
+        </w:tc>
+      </w:tr>
+      <w:tr>
+        <w:tc>
+          <w:tcPr>
+            <w:tcW w:type="dxa" w:w="4680"/>
+          </w:tcPr>
+          <w:p>
+            <w:r>
+              <w:t>describe()</w:t>
+            </w:r>
+          </w:p>
+        </w:tc>
+        <w:tc>
+          <w:tcPr>
+            <w:tcW w:type="dxa" w:w="4680"/>
+          </w:tcPr>
+          <w:p>
+            <w:r>
+              <w:t>Full model description</w:t>
+            </w:r>
+          </w:p>
+        </w:tc>
+      </w:tr>
+      <w:tr>
+        <w:tc>
+          <w:tcPr>
+            <w:tcW w:type="dxa" w:w="4680"/>
+          </w:tcPr>
+          <w:p>
+            <w:r>
+              <w:t>list_bays()</w:t>
+            </w:r>
+          </w:p>
+        </w:tc>
+        <w:tc>
+          <w:tcPr>
+            <w:tcW w:type="dxa" w:w="4680"/>
+          </w:tcPr>
+          <w:p>
+            <w:r>
+              <w:t>Compact bay table</w:t>
+            </w:r>
+          </w:p>
+        </w:tc>
+      </w:tr>
+      <w:tr>
+        <w:tc>
+          <w:tcPr>
+            <w:tcW w:type="dxa" w:w="4680"/>
+          </w:tcPr>
+          <w:p>
+            <w:r>
+              <w:t>get_state()</w:t>
+            </w:r>
+          </w:p>
+        </w:tc>
+        <w:tc>
+          <w:tcPr>
+            <w:tcW w:type="dxa" w:w="4680"/>
+          </w:tcPr>
+          <w:p>
+            <w:r>
+              <w:t>Raw JSON state</w:t>
+            </w:r>
+          </w:p>
+        </w:tc>
+      </w:tr>
+      <w:tr>
+        <w:tc>
+          <w:tcPr>
+            <w:tcW w:type="dxa" w:w="4680"/>
+          </w:tcPr>
+          <w:p>
+            <w:r>
+              <w:t>get_help()</w:t>
+            </w:r>
+          </w:p>
+        </w:tc>
+        <w:tc>
+          <w:tcPr>
+            <w:tcW w:type="dxa" w:w="4680"/>
+          </w:tcPr>
+          <w:p>
+            <w:r>
+              <w:t>Command reference text</w:t>
+            </w:r>
+          </w:p>
+        </w:tc>
+      </w:tr>
+    </w:tbl>
+    <w:p>
+      <w:pPr>
         <w:pStyle w:val="Heading1"/>
         <w:pBdr>
           <w:bottom w:val="single" w:color="2C3E7B" w:sz="4" w:space="10"/>
@@ -16456,7 +17488,7 @@
           <w:sz w:val="36"/>
           <w:szCs w:val="36"/>
         </w:rPr>
-        <w:t xml:space="preserve">14  Rhino Layer Map</w:t>
+        <w:t>18  Rhino Layer Map</w:t>
       </w:r>
     </w:p>
     <w:p>
@@ -17527,7 +18559,7 @@
           <w:sz w:val="36"/>
           <w:szCs w:val="36"/>
         </w:rPr>
-        <w:t xml:space="preserve">15  Extending the Jig with an LLM</w:t>
+        <w:t>19  Extending the Jig with an LLM</w:t>
       </w:r>
     </w:p>
     <w:p>
@@ -17564,7 +18596,7 @@
           <w:sz w:val="26"/>
           <w:szCs w:val="26"/>
         </w:rPr>
-        <w:t xml:space="preserve">15.1  The Key Principle</w:t>
+        <w:t>19.1  The Key Principle</w:t>
       </w:r>
     </w:p>
     <w:p>
@@ -17673,7 +18705,7 @@
           <w:sz w:val="26"/>
           <w:szCs w:val="26"/>
         </w:rPr>
-        <w:t xml:space="preserve">15.2  Recipe for a New Command</w:t>
+        <w:t>19.2  Recipe for a New Command</w:t>
       </w:r>
     </w:p>
     <w:p>
@@ -17931,7 +18963,7 @@
           <w:sz w:val="26"/>
           <w:szCs w:val="26"/>
         </w:rPr>
-        <w:t xml:space="preserve">15.3  Adding a Bay Property</w:t>
+        <w:t>19.3  Adding a Bay Property</w:t>
       </w:r>
     </w:p>
     <w:p>
@@ -18065,7 +19097,7 @@
           <w:sz w:val="26"/>
           <w:szCs w:val="26"/>
         </w:rPr>
-        <w:t xml:space="preserve">15.4  Pitfalls to Warn the LLM About</w:t>
+        <w:t>19.4  Pitfalls to Warn the LLM About</w:t>
       </w:r>
     </w:p>
     <w:p>
@@ -18262,7 +19294,7 @@
           <w:sz w:val="26"/>
           <w:szCs w:val="26"/>
         </w:rPr>
-        <w:t xml:space="preserve">15.5  Feature Ideas</w:t>
+        <w:t>19.5  Feature Ideas</w:t>
       </w:r>
     </w:p>
     <w:p>
@@ -18452,7 +19484,7 @@
           <w:sz w:val="22"/>
           <w:szCs w:val="22"/>
         </w:rPr>
-        <w:t xml:space="preserve">JAWS screen reader mode</w:t>
+        <w:t>JAWS screen reader mode — a --sr flag that reformats all output for linear reading. (See also Section 11 for the TTS feature, now implemented.)</w:t>
       </w:r>
       <w:r>
         <w:rPr>
@@ -18465,7 +19497,6 @@
           <w:sz w:val="22"/>
           <w:szCs w:val="22"/>
         </w:rPr>
-        <w:t xml:space="preserve"> — a --sr flag that reformats all output for linear reading: no decorative lines, comma-separated values instead of aligned columns, tiered describe depth.</w:t>
       </w:r>
     </w:p>
     <w:p>
@@ -18556,7 +19587,7 @@
           <w:sz w:val="26"/>
           <w:szCs w:val="26"/>
         </w:rPr>
-        <w:t xml:space="preserve">15.6  Prompt Template</w:t>
+        <w:t>19.6  Prompt Template</w:t>
       </w:r>
     </w:p>
     <w:p>

</xml_diff>